<commit_message>
Actualiza documento de prototipado UX con IA
</commit_message>
<xml_diff>
--- a/C055_UNIR_Prototipado UX con inteligencia artificial.docx
+++ b/C055_UNIR_Prototipado UX con inteligencia artificial.docx
@@ -29,7 +29,10 @@
       </w:r>
     </w:p>
     <w:p/>
-    <w:p/>
+    <w:p>
+      <w:bookmarkStart w:id="0" w:name="_GoBack"/>
+      <w:bookmarkEnd w:id="0"/>
+    </w:p>
     <w:p/>
     <w:p/>
     <w:p>
@@ -67,7 +70,19 @@
       </w:r>
       <w:r>
         <w:br/>
-        <w:t>Integrante 1: UX Researcher (</w:t>
+        <w:t>Integrante 1:</w:t>
+      </w:r>
+      <w:r>
+        <w:t xml:space="preserve"> </w:t>
+      </w:r>
+      <w:r>
+        <w:t>Daniel Gabriel González</w:t>
+      </w:r>
+      <w:r>
+        <w:t>,</w:t>
+      </w:r>
+      <w:r>
+        <w:t xml:space="preserve"> UX Researcher (</w:t>
       </w:r>
       <w:r>
         <w:t>Líder</w:t>
@@ -77,7 +92,19 @@
       </w:r>
       <w:r>
         <w:br/>
-        <w:t>Integrante 2: UX Strategist &amp; AI Lead (</w:t>
+        <w:t xml:space="preserve">Integrante 2: </w:t>
+      </w:r>
+      <w:r>
+        <w:t>Daniel Cinto Conde</w:t>
+      </w:r>
+      <w:r>
+        <w:t>,</w:t>
+      </w:r>
+      <w:r>
+        <w:t xml:space="preserve"> </w:t>
+      </w:r>
+      <w:r>
+        <w:t>UX Strategist &amp; AI Lead (</w:t>
       </w:r>
       <w:r>
         <w:t>Líder</w:t>
@@ -87,7 +114,19 @@
       </w:r>
       <w:r>
         <w:br/>
-        <w:t>Integrante 3: Information Architect (</w:t>
+        <w:t>Integrante 3:</w:t>
+      </w:r>
+      <w:r>
+        <w:t xml:space="preserve"> </w:t>
+      </w:r>
+      <w:r>
+        <w:t>Francisco Javier González García</w:t>
+      </w:r>
+      <w:r>
+        <w:t>,</w:t>
+      </w:r>
+      <w:r>
+        <w:t xml:space="preserve"> Information Architect (</w:t>
       </w:r>
       <w:r>
         <w:t>Líder</w:t>
@@ -97,7 +136,16 @@
       </w:r>
       <w:r>
         <w:br/>
-        <w:t>Integrante 4: UI/UX Designer (</w:t>
+        <w:t xml:space="preserve">Integrante 4: </w:t>
+      </w:r>
+      <w:r>
+        <w:t>Cristian Yamir Jiménez Rebollar</w:t>
+      </w:r>
+      <w:r>
+        <w:t xml:space="preserve">, </w:t>
+      </w:r>
+      <w:r>
+        <w:t>UI/UX Designer (</w:t>
       </w:r>
       <w:r>
         <w:t>Líder</w:t>
@@ -107,10 +155,16 @@
       </w:r>
       <w:r>
         <w:br/>
-        <w:t xml:space="preserve">Integrante 5: Interaction QA &amp; </w:t>
-      </w:r>
-      <w:r>
-        <w:t>Editor (</w:t>
+        <w:t xml:space="preserve">Integrante 5: </w:t>
+      </w:r>
+      <w:r>
+        <w:t>Miguel Ángel Sánchez Martínez</w:t>
+      </w:r>
+      <w:r>
+        <w:t xml:space="preserve">, </w:t>
+      </w:r>
+      <w:r>
+        <w:t>Interaction QA &amp; Editor (</w:t>
       </w:r>
       <w:r>
         <w:t>Líder</w:t>
@@ -176,6 +230,9 @@
       </w:r>
     </w:p>
     <w:p>
+      <w:pPr>
+        <w:jc w:val="both"/>
+      </w:pPr>
       <w:r>
         <w:t xml:space="preserve">La presente actividad </w:t>
       </w:r>
@@ -201,10 +258,7 @@
         <w:t>teórico</w:t>
       </w:r>
       <w:r>
-        <w:t xml:space="preserve"> y p</w:t>
-      </w:r>
-      <w:r>
-        <w:t xml:space="preserve">ractico sobre el </w:t>
+        <w:t xml:space="preserve"> y practico sobre el </w:t>
       </w:r>
       <w:r>
         <w:t>diseño</w:t>
@@ -274,6 +328,9 @@
       </w:r>
     </w:p>
     <w:p>
+      <w:pPr>
+        <w:jc w:val="both"/>
+      </w:pPr>
       <w:r>
         <w:t xml:space="preserve">El documento se estructura en once secciones que recorren el ciclo de vida completo de un proyecto de UX/UI: la </w:t>
       </w:r>
@@ -281,10 +338,7 @@
         <w:t>investigación</w:t>
       </w:r>
       <w:r>
-        <w:t xml:space="preserve"> conce</w:t>
-      </w:r>
-      <w:r>
-        <w:t xml:space="preserve">ptual, la </w:t>
+        <w:t xml:space="preserve"> conceptual, la </w:t>
       </w:r>
       <w:r>
         <w:t>definición</w:t>
@@ -320,10 +374,7 @@
         <w:t>reflexión</w:t>
       </w:r>
       <w:r>
-        <w:t xml:space="preserve"> critica sobre el uso de inteligencia artif</w:t>
-      </w:r>
-      <w:r>
-        <w:t xml:space="preserve">icial en el </w:t>
+        <w:t xml:space="preserve"> critica sobre el uso de inteligencia artificial en el </w:t>
       </w:r>
       <w:r>
         <w:t>diseño</w:t>
@@ -359,10 +410,7 @@
         <w:t>hipótesis</w:t>
       </w:r>
       <w:r>
-        <w:t xml:space="preserve"> en cada una de las etapas del proceso, asi como a </w:t>
-      </w:r>
-      <w:r>
-        <w:t xml:space="preserve">los principios de </w:t>
+        <w:t xml:space="preserve"> en cada una de las etapas del proceso, asi como a los principios de </w:t>
       </w:r>
       <w:r>
         <w:t>diseño</w:t>
@@ -394,41 +442,48 @@
       </w:pPr>
       <w:r>
         <w:lastRenderedPageBreak/>
+        <w:t xml:space="preserve">Fase </w:t>
+      </w:r>
+      <w:r>
         <w:t xml:space="preserve">1. </w:t>
       </w:r>
       <w:r>
-        <w:t>Matriz Comparativa</w:t>
+        <w:t>Investigación Conceptual</w:t>
       </w:r>
     </w:p>
     <w:p>
       <w:pPr>
-        <w:spacing w:after="40"/>
+        <w:pStyle w:val="Ttulo2"/>
       </w:pPr>
+      <w:r>
+        <w:t>Matriz Comparativa</w:t>
+      </w:r>
     </w:p>
     <w:tbl>
       <w:tblPr>
-        <w:tblW w:w="0" w:type="auto"/>
-        <w:jc w:val="center"/>
+        <w:tblW w:w="10031" w:type="dxa"/>
         <w:tblLook w:val="04A0" w:firstRow="1" w:lastRow="0" w:firstColumn="1" w:lastColumn="0" w:noHBand="0" w:noVBand="1"/>
       </w:tblPr>
       <w:tblGrid>
         <w:gridCol w:w="1134"/>
         <w:gridCol w:w="2551"/>
         <w:gridCol w:w="2268"/>
-        <w:gridCol w:w="1020"/>
-        <w:gridCol w:w="1531"/>
+        <w:gridCol w:w="1385"/>
+        <w:gridCol w:w="2693"/>
       </w:tblGrid>
       <w:tr>
-        <w:trPr>
-          <w:jc w:val="center"/>
-        </w:trPr>
         <w:tc>
           <w:tcPr>
             <w:tcW w:w="1134" w:type="dxa"/>
+            <w:tcBorders>
+              <w:bottom w:val="single" w:sz="4" w:space="0" w:color="auto"/>
+            </w:tcBorders>
+            <w:shd w:val="clear" w:color="auto" w:fill="DDD9C3" w:themeFill="background2" w:themeFillShade="E6"/>
           </w:tcPr>
           <w:p>
             <w:pPr>
               <w:spacing w:before="20" w:after="20"/>
+              <w:jc w:val="center"/>
             </w:pPr>
             <w:r>
               <w:rPr>
@@ -442,10 +497,15 @@
         <w:tc>
           <w:tcPr>
             <w:tcW w:w="2551" w:type="dxa"/>
+            <w:tcBorders>
+              <w:bottom w:val="single" w:sz="4" w:space="0" w:color="auto"/>
+            </w:tcBorders>
+            <w:shd w:val="clear" w:color="auto" w:fill="DDD9C3" w:themeFill="background2" w:themeFillShade="E6"/>
           </w:tcPr>
           <w:p>
             <w:pPr>
               <w:spacing w:before="20" w:after="20"/>
+              <w:jc w:val="center"/>
             </w:pPr>
             <w:r>
               <w:rPr>
@@ -459,10 +519,15 @@
         <w:tc>
           <w:tcPr>
             <w:tcW w:w="2268" w:type="dxa"/>
+            <w:tcBorders>
+              <w:bottom w:val="single" w:sz="4" w:space="0" w:color="auto"/>
+            </w:tcBorders>
+            <w:shd w:val="clear" w:color="auto" w:fill="DDD9C3" w:themeFill="background2" w:themeFillShade="E6"/>
           </w:tcPr>
           <w:p>
             <w:pPr>
               <w:spacing w:before="20" w:after="20"/>
+              <w:jc w:val="center"/>
             </w:pPr>
             <w:r>
               <w:rPr>
@@ -475,11 +540,16 @@
         </w:tc>
         <w:tc>
           <w:tcPr>
-            <w:tcW w:w="1020" w:type="dxa"/>
+            <w:tcW w:w="1385" w:type="dxa"/>
+            <w:tcBorders>
+              <w:bottom w:val="single" w:sz="4" w:space="0" w:color="auto"/>
+            </w:tcBorders>
+            <w:shd w:val="clear" w:color="auto" w:fill="DDD9C3" w:themeFill="background2" w:themeFillShade="E6"/>
           </w:tcPr>
           <w:p>
             <w:pPr>
               <w:spacing w:before="20" w:after="20"/>
+              <w:jc w:val="center"/>
             </w:pPr>
             <w:r>
               <w:rPr>
@@ -492,11 +562,16 @@
         </w:tc>
         <w:tc>
           <w:tcPr>
-            <w:tcW w:w="1531" w:type="dxa"/>
+            <w:tcW w:w="2693" w:type="dxa"/>
+            <w:tcBorders>
+              <w:bottom w:val="single" w:sz="4" w:space="0" w:color="auto"/>
+            </w:tcBorders>
+            <w:shd w:val="clear" w:color="auto" w:fill="DDD9C3" w:themeFill="background2" w:themeFillShade="E6"/>
           </w:tcPr>
           <w:p>
             <w:pPr>
               <w:spacing w:before="20" w:after="20"/>
+              <w:jc w:val="center"/>
             </w:pPr>
             <w:r>
               <w:rPr>
@@ -509,12 +584,15 @@
         </w:tc>
       </w:tr>
       <w:tr>
-        <w:trPr>
-          <w:jc w:val="center"/>
-        </w:trPr>
         <w:tc>
           <w:tcPr>
             <w:tcW w:w="1134" w:type="dxa"/>
+            <w:tcBorders>
+              <w:top w:val="single" w:sz="4" w:space="0" w:color="auto"/>
+              <w:left w:val="single" w:sz="4" w:space="0" w:color="auto"/>
+              <w:bottom w:val="single" w:sz="4" w:space="0" w:color="auto"/>
+              <w:right w:val="single" w:sz="4" w:space="0" w:color="auto"/>
+            </w:tcBorders>
           </w:tcPr>
           <w:p>
             <w:pPr>
@@ -538,7 +616,27 @@
         <w:tc>
           <w:tcPr>
             <w:tcW w:w="2551" w:type="dxa"/>
+            <w:tcBorders>
+              <w:top w:val="single" w:sz="4" w:space="0" w:color="auto"/>
+              <w:left w:val="single" w:sz="4" w:space="0" w:color="auto"/>
+              <w:bottom w:val="single" w:sz="4" w:space="0" w:color="auto"/>
+              <w:right w:val="single" w:sz="4" w:space="0" w:color="auto"/>
+            </w:tcBorders>
           </w:tcPr>
+          <w:p>
+            <w:pPr>
+              <w:spacing w:before="20" w:after="20"/>
+              <w:rPr>
+                <w:sz w:val="16"/>
+              </w:rPr>
+            </w:pPr>
+            <w:r>
+              <w:rPr>
+                <w:sz w:val="16"/>
+              </w:rPr>
+              <w:t>Representación esquemática de baja fidelidad en escala de grises. Cajas, placeholders y jerarquía sin estilo visual.</w:t>
+            </w:r>
+          </w:p>
           <w:p>
             <w:pPr>
               <w:spacing w:before="20" w:after="20"/>
@@ -547,19 +645,81 @@
               <w:rPr>
                 <w:sz w:val="16"/>
               </w:rPr>
-              <w:t xml:space="preserve">Representación esquemática de baja </w:t>
+              <w:t>“es</w:t>
             </w:r>
             <w:r>
               <w:rPr>
                 <w:sz w:val="16"/>
               </w:rPr>
-              <w:t>fidelidad en escala de grises. Cajas, placeholders y jerarquía sin estilo visual.</w:t>
+              <w:t xml:space="preserve"> el esqueleto de su proyecto digital,… Se centra en el diseño y la ubicación del contenido, no en los colores, las fuentes o cualquier pulido visual</w:t>
             </w:r>
+            <w:r>
+              <w:rPr>
+                <w:sz w:val="16"/>
+              </w:rPr>
+              <w:t>”</w:t>
+            </w:r>
+            <w:sdt>
+              <w:sdtPr>
+                <w:rPr>
+                  <w:sz w:val="16"/>
+                </w:rPr>
+                <w:id w:val="1978257167"/>
+                <w:citation/>
+              </w:sdtPr>
+              <w:sdtEndPr/>
+              <w:sdtContent>
+                <w:r>
+                  <w:rPr>
+                    <w:sz w:val="16"/>
+                  </w:rPr>
+                  <w:fldChar w:fldCharType="begin"/>
+                </w:r>
+                <w:r>
+                  <w:rPr>
+                    <w:sz w:val="16"/>
+                  </w:rPr>
+                  <w:instrText xml:space="preserve"> CITATION PelGuil \l 2058 </w:instrText>
+                </w:r>
+                <w:r>
+                  <w:rPr>
+                    <w:sz w:val="16"/>
+                  </w:rPr>
+                  <w:fldChar w:fldCharType="separate"/>
+                </w:r>
+                <w:r>
+                  <w:rPr>
+                    <w:noProof/>
+                    <w:sz w:val="16"/>
+                  </w:rPr>
+                  <w:t xml:space="preserve"> </w:t>
+                </w:r>
+                <w:r>
+                  <w:rPr>
+                    <w:noProof/>
+                    <w:sz w:val="16"/>
+                  </w:rPr>
+                  <w:t>(Guilizzoni, 2025)</w:t>
+                </w:r>
+                <w:r>
+                  <w:rPr>
+                    <w:sz w:val="16"/>
+                  </w:rPr>
+                  <w:fldChar w:fldCharType="end"/>
+                </w:r>
+              </w:sdtContent>
+            </w:sdt>
           </w:p>
         </w:tc>
         <w:tc>
           <w:tcPr>
             <w:tcW w:w="2268" w:type="dxa"/>
+            <w:tcBorders>
+              <w:top w:val="single" w:sz="4" w:space="0" w:color="auto"/>
+              <w:left w:val="single" w:sz="4" w:space="0" w:color="auto"/>
+              <w:bottom w:val="single" w:sz="4" w:space="0" w:color="auto"/>
+              <w:right w:val="single" w:sz="4" w:space="0" w:color="auto"/>
+            </w:tcBorders>
           </w:tcPr>
           <w:p>
             <w:pPr>
@@ -575,7 +735,13 @@
         </w:tc>
         <w:tc>
           <w:tcPr>
-            <w:tcW w:w="1020" w:type="dxa"/>
+            <w:tcW w:w="1385" w:type="dxa"/>
+            <w:tcBorders>
+              <w:top w:val="single" w:sz="4" w:space="0" w:color="auto"/>
+              <w:left w:val="single" w:sz="4" w:space="0" w:color="auto"/>
+              <w:bottom w:val="single" w:sz="4" w:space="0" w:color="auto"/>
+              <w:right w:val="single" w:sz="4" w:space="0" w:color="auto"/>
+            </w:tcBorders>
           </w:tcPr>
           <w:p>
             <w:pPr>
@@ -591,7 +757,13 @@
         </w:tc>
         <w:tc>
           <w:tcPr>
-            <w:tcW w:w="1531" w:type="dxa"/>
+            <w:tcW w:w="2693" w:type="dxa"/>
+            <w:tcBorders>
+              <w:top w:val="single" w:sz="4" w:space="0" w:color="auto"/>
+              <w:left w:val="single" w:sz="4" w:space="0" w:color="auto"/>
+              <w:bottom w:val="single" w:sz="4" w:space="0" w:color="auto"/>
+              <w:right w:val="single" w:sz="4" w:space="0" w:color="auto"/>
+            </w:tcBorders>
           </w:tcPr>
           <w:p>
             <w:pPr>
@@ -607,12 +779,15 @@
         </w:tc>
       </w:tr>
       <w:tr>
-        <w:trPr>
-          <w:jc w:val="center"/>
-        </w:trPr>
         <w:tc>
           <w:tcPr>
             <w:tcW w:w="1134" w:type="dxa"/>
+            <w:tcBorders>
+              <w:top w:val="single" w:sz="4" w:space="0" w:color="auto"/>
+              <w:left w:val="single" w:sz="4" w:space="0" w:color="auto"/>
+              <w:bottom w:val="single" w:sz="4" w:space="0" w:color="auto"/>
+              <w:right w:val="single" w:sz="4" w:space="0" w:color="auto"/>
+            </w:tcBorders>
           </w:tcPr>
           <w:p>
             <w:pPr>
@@ -622,13 +797,7 @@
               <w:rPr>
                 <w:sz w:val="16"/>
               </w:rPr>
-              <w:t>Mocku</w:t>
-            </w:r>
-            <w:r>
-              <w:rPr>
-                <w:sz w:val="16"/>
-              </w:rPr>
-              <w:t>p</w:t>
+              <w:t>Mockup</w:t>
             </w:r>
             <w:r>
               <w:rPr>
@@ -642,6 +811,12 @@
         <w:tc>
           <w:tcPr>
             <w:tcW w:w="2551" w:type="dxa"/>
+            <w:tcBorders>
+              <w:top w:val="single" w:sz="4" w:space="0" w:color="auto"/>
+              <w:left w:val="single" w:sz="4" w:space="0" w:color="auto"/>
+              <w:bottom w:val="single" w:sz="4" w:space="0" w:color="auto"/>
+              <w:right w:val="single" w:sz="4" w:space="0" w:color="auto"/>
+            </w:tcBorders>
           </w:tcPr>
           <w:p>
             <w:pPr>
@@ -658,6 +833,12 @@
         <w:tc>
           <w:tcPr>
             <w:tcW w:w="2268" w:type="dxa"/>
+            <w:tcBorders>
+              <w:top w:val="single" w:sz="4" w:space="0" w:color="auto"/>
+              <w:left w:val="single" w:sz="4" w:space="0" w:color="auto"/>
+              <w:bottom w:val="single" w:sz="4" w:space="0" w:color="auto"/>
+              <w:right w:val="single" w:sz="4" w:space="0" w:color="auto"/>
+            </w:tcBorders>
           </w:tcPr>
           <w:p>
             <w:pPr>
@@ -673,7 +854,13 @@
         </w:tc>
         <w:tc>
           <w:tcPr>
-            <w:tcW w:w="1020" w:type="dxa"/>
+            <w:tcW w:w="1385" w:type="dxa"/>
+            <w:tcBorders>
+              <w:top w:val="single" w:sz="4" w:space="0" w:color="auto"/>
+              <w:left w:val="single" w:sz="4" w:space="0" w:color="auto"/>
+              <w:bottom w:val="single" w:sz="4" w:space="0" w:color="auto"/>
+              <w:right w:val="single" w:sz="4" w:space="0" w:color="auto"/>
+            </w:tcBorders>
           </w:tcPr>
           <w:p>
             <w:pPr>
@@ -689,7 +876,13 @@
         </w:tc>
         <w:tc>
           <w:tcPr>
-            <w:tcW w:w="1531" w:type="dxa"/>
+            <w:tcW w:w="2693" w:type="dxa"/>
+            <w:tcBorders>
+              <w:top w:val="single" w:sz="4" w:space="0" w:color="auto"/>
+              <w:left w:val="single" w:sz="4" w:space="0" w:color="auto"/>
+              <w:bottom w:val="single" w:sz="4" w:space="0" w:color="auto"/>
+              <w:right w:val="single" w:sz="4" w:space="0" w:color="auto"/>
+            </w:tcBorders>
           </w:tcPr>
           <w:p>
             <w:pPr>
@@ -699,24 +892,21 @@
               <w:rPr>
                 <w:sz w:val="16"/>
               </w:rPr>
-              <w:t xml:space="preserve">Mitad: Diseño Visual UI. Tras </w:t>
-            </w:r>
-            <w:r>
-              <w:rPr>
-                <w:sz w:val="16"/>
-              </w:rPr>
-              <w:t>aprobación de wireframes. Handoff a dev.</w:t>
+              <w:t>Mitad: Diseño Visual UI. Tras aprobación de wireframes. Handoff a dev.</w:t>
             </w:r>
           </w:p>
         </w:tc>
       </w:tr>
       <w:tr>
-        <w:trPr>
-          <w:jc w:val="center"/>
-        </w:trPr>
         <w:tc>
           <w:tcPr>
             <w:tcW w:w="1134" w:type="dxa"/>
+            <w:tcBorders>
+              <w:top w:val="single" w:sz="4" w:space="0" w:color="auto"/>
+              <w:left w:val="single" w:sz="4" w:space="0" w:color="auto"/>
+              <w:bottom w:val="single" w:sz="4" w:space="0" w:color="auto"/>
+              <w:right w:val="single" w:sz="4" w:space="0" w:color="auto"/>
+            </w:tcBorders>
           </w:tcPr>
           <w:p>
             <w:pPr>
@@ -740,6 +930,12 @@
         <w:tc>
           <w:tcPr>
             <w:tcW w:w="2551" w:type="dxa"/>
+            <w:tcBorders>
+              <w:top w:val="single" w:sz="4" w:space="0" w:color="auto"/>
+              <w:left w:val="single" w:sz="4" w:space="0" w:color="auto"/>
+              <w:bottom w:val="single" w:sz="4" w:space="0" w:color="auto"/>
+              <w:right w:val="single" w:sz="4" w:space="0" w:color="auto"/>
+            </w:tcBorders>
           </w:tcPr>
           <w:p>
             <w:pPr>
@@ -756,6 +952,12 @@
         <w:tc>
           <w:tcPr>
             <w:tcW w:w="2268" w:type="dxa"/>
+            <w:tcBorders>
+              <w:top w:val="single" w:sz="4" w:space="0" w:color="auto"/>
+              <w:left w:val="single" w:sz="4" w:space="0" w:color="auto"/>
+              <w:bottom w:val="single" w:sz="4" w:space="0" w:color="auto"/>
+              <w:right w:val="single" w:sz="4" w:space="0" w:color="auto"/>
+            </w:tcBorders>
           </w:tcPr>
           <w:p>
             <w:pPr>
@@ -765,19 +967,19 @@
               <w:rPr>
                 <w:sz w:val="16"/>
               </w:rPr>
-              <w:t>Validar interacción, usabilidad, flujo completo y viabilidad. Test con us</w:t>
-            </w:r>
-            <w:r>
-              <w:rPr>
-                <w:sz w:val="16"/>
-              </w:rPr>
-              <w:t>uarios reales.</w:t>
+              <w:t>Validar interacción, usabilidad, flujo completo y viabilidad. Test con usuarios reales.</w:t>
             </w:r>
           </w:p>
         </w:tc>
         <w:tc>
           <w:tcPr>
-            <w:tcW w:w="1020" w:type="dxa"/>
+            <w:tcW w:w="1385" w:type="dxa"/>
+            <w:tcBorders>
+              <w:top w:val="single" w:sz="4" w:space="0" w:color="auto"/>
+              <w:left w:val="single" w:sz="4" w:space="0" w:color="auto"/>
+              <w:bottom w:val="single" w:sz="4" w:space="0" w:color="auto"/>
+              <w:right w:val="single" w:sz="4" w:space="0" w:color="auto"/>
+            </w:tcBorders>
           </w:tcPr>
           <w:p>
             <w:pPr>
@@ -793,7 +995,13 @@
         </w:tc>
         <w:tc>
           <w:tcPr>
-            <w:tcW w:w="1531" w:type="dxa"/>
+            <w:tcW w:w="2693" w:type="dxa"/>
+            <w:tcBorders>
+              <w:top w:val="single" w:sz="4" w:space="0" w:color="auto"/>
+              <w:left w:val="single" w:sz="4" w:space="0" w:color="auto"/>
+              <w:bottom w:val="single" w:sz="4" w:space="0" w:color="auto"/>
+              <w:right w:val="single" w:sz="4" w:space="0" w:color="auto"/>
+            </w:tcBorders>
           </w:tcPr>
           <w:p>
             <w:pPr>
@@ -812,10 +1020,10 @@
     <w:p/>
     <w:p>
       <w:pPr>
-        <w:pStyle w:val="Ttulo1"/>
+        <w:pStyle w:val="Ttulo2"/>
       </w:pPr>
       <w:r>
-        <w:t xml:space="preserve">2. Ventajas y Limitaciones </w:t>
+        <w:t xml:space="preserve">Ventajas y Limitaciones </w:t>
       </w:r>
       <w:r>
         <w:t>Críticas</w:t>
@@ -846,10 +1054,7 @@
         <w:t xml:space="preserve">Mockup: </w:t>
       </w:r>
       <w:r>
-        <w:t>+ Valida estética, Design System y marca; entregable preciso para desarrollo. - Est</w:t>
-      </w:r>
-      <w:r>
-        <w:t>ático; oculta errores de flujo e interacción; un diseño bonito puede esconder mala UX.</w:t>
+        <w:t>+ Valida estética, Design System y marca; entregable preciso para desarrollo. - Estático; oculta errores de flujo e interacción; un diseño bonito puede esconder mala UX.</w:t>
       </w:r>
     </w:p>
     <w:p>
@@ -869,10 +1074,115 @@
         <w:t>re trabajo</w:t>
       </w:r>
       <w:r>
-        <w:t>. - Mayor tiempo de producción; requiere herramientas; riesgo de</w:t>
-      </w:r>
-      <w:r>
-        <w:t xml:space="preserve"> falsa sensación de producto terminado.</w:t>
+        <w:t>. - Mayor tiempo de producción; requiere herramientas; riesgo de falsa sensación de producto terminado.</w:t>
+      </w:r>
+    </w:p>
+    <w:p>
+      <w:pPr>
+        <w:pStyle w:val="Ttulo2"/>
+      </w:pPr>
+      <w:r>
+        <w:t>Ejemplo Práctico Unificado</w:t>
+      </w:r>
+    </w:p>
+    <w:p>
+      <w:pPr>
+        <w:spacing w:after="40"/>
+      </w:pPr>
+      <w:r>
+        <w:t>App móvil FinTech "Capital" - Dashboard de Gastos Mensuales. Misma pantalla, tres evoluciones:</w:t>
+      </w:r>
+    </w:p>
+    <w:p>
+      <w:pPr>
+        <w:spacing w:after="40"/>
+      </w:pPr>
+      <w:r>
+        <w:rPr>
+          <w:b/>
+        </w:rPr>
+        <w:t xml:space="preserve">Wireframe: </w:t>
+      </w:r>
+      <w:r>
+        <w:t>[Header] [Balance: $XXXX] [Gráfico barras grises] [Lista transacciones] [FAB: +]. Sin color. Valida prioridad de contenido.</w:t>
+      </w:r>
+    </w:p>
+    <w:p>
+      <w:pPr>
+        <w:spacing w:after="40"/>
+      </w:pPr>
+      <w:r>
+        <w:rPr>
+          <w:b/>
+        </w:rPr>
+        <w:t xml:space="preserve">Mockup: </w:t>
+      </w:r>
+      <w:r>
+        <w:t>Fondo #0A0A0B, glassmorphism, gráfico azul #4D7FC1, tipografía Manrope Bold. Valida identidad visual, contraste y coherencia de marca.</w:t>
+      </w:r>
+    </w:p>
+    <w:p>
+      <w:pPr>
+        <w:spacing w:after="40"/>
+      </w:pPr>
+      <w:r>
+        <w:rPr>
+          <w:b/>
+        </w:rPr>
+        <w:t xml:space="preserve">Prototipo (Figma High-Fi): </w:t>
+      </w:r>
+      <w:r>
+        <w:t>Interacciones: tap en gráfico filtra lista; swipe acciones Editar/Eliminar; tap en + bottom sheet animado; estado vacío con Lottie. Valida con test de usabilidad (n=5).</w:t>
+      </w:r>
+    </w:p>
+    <w:p>
+      <w:pPr>
+        <w:pStyle w:val="Ttulo2"/>
+      </w:pPr>
+      <w:r>
+        <w:lastRenderedPageBreak/>
+        <w:t>Conclusión Estratégica - Regla de Decisión</w:t>
+      </w:r>
+    </w:p>
+    <w:p>
+      <w:pPr>
+        <w:spacing w:after="40"/>
+      </w:pPr>
+      <w:r>
+        <w:t>Si validas QUÉ se construye -&gt; Wireframe. Si validas CÓMO SE VE -&gt; Mockup. Si validas CÓMO SE SIENTE Y FLUYE -&gt; Prototipo.</w:t>
+      </w:r>
+    </w:p>
+    <w:p>
+      <w:pPr>
+        <w:spacing w:after="40"/>
+      </w:pPr>
+      <w:r>
+        <w:rPr>
+          <w:b/>
+        </w:rPr>
+        <w:t xml:space="preserve">Error crítico que genera costo: </w:t>
+      </w:r>
+      <w:r>
+        <w:t>Saltar del wireframe directo a desarrollo sin mockup ni prototipo. Resultado: producto funcionalmente correcto pero visualmente pobre e inusable. El costo de corrección en código es 10x superior al costo en fase de diseño (Principio de Boehm).</w:t>
+      </w:r>
+    </w:p>
+    <w:p>
+      <w:pPr>
+        <w:spacing w:after="40"/>
+      </w:pPr>
+      <w:r>
+        <w:rPr>
+          <w:b/>
+        </w:rPr>
+        <w:t xml:space="preserve">Estándar académico recomendado: </w:t>
+      </w:r>
+      <w:r>
+        <w:t>Wireframe -&gt; Test de estructura -&gt; Mockup + Design System -&gt; Prototipo High-Fi -&gt; Test de usabilidad (n=5) -&gt; Handoff a desarrollo.</w:t>
+      </w:r>
+    </w:p>
+    <w:p>
+      <w:r>
+        <w:br w:type="page"/>
       </w:r>
     </w:p>
     <w:p>
@@ -880,128 +1190,6 @@
         <w:pStyle w:val="Ttulo1"/>
       </w:pPr>
       <w:r>
-        <w:t>3. Ejemplo Práctico Unificado</w:t>
-      </w:r>
-    </w:p>
-    <w:p>
-      <w:pPr>
-        <w:spacing w:after="40"/>
-      </w:pPr>
-      <w:r>
-        <w:t>App móvil FinTech "Capital" - Dashboard de Gastos Mensuales. Misma pantalla, tres evoluciones:</w:t>
-      </w:r>
-    </w:p>
-    <w:p>
-      <w:pPr>
-        <w:spacing w:after="40"/>
-      </w:pPr>
-      <w:r>
-        <w:rPr>
-          <w:b/>
-        </w:rPr>
-        <w:t xml:space="preserve">Wireframe: </w:t>
-      </w:r>
-      <w:r>
-        <w:t>[Header] [Balance: $XXXX] [Gráfico barras grises] [Lista transacciones] [FAB: +]</w:t>
-      </w:r>
-      <w:r>
-        <w:t>. Sin color. Valida prioridad de contenido.</w:t>
-      </w:r>
-    </w:p>
-    <w:p>
-      <w:pPr>
-        <w:spacing w:after="40"/>
-      </w:pPr>
-      <w:r>
-        <w:rPr>
-          <w:b/>
-        </w:rPr>
-        <w:t xml:space="preserve">Mockup: </w:t>
-      </w:r>
-      <w:r>
-        <w:t>Fondo #0A0A0B, glassmorphism, gráfico azul #4D7FC1, tipografía Manrope Bold. Valida identidad visual, contraste y coherencia de marca.</w:t>
-      </w:r>
-    </w:p>
-    <w:p>
-      <w:pPr>
-        <w:spacing w:after="40"/>
-      </w:pPr>
-      <w:r>
-        <w:rPr>
-          <w:b/>
-        </w:rPr>
-        <w:t xml:space="preserve">Prototipo (Figma High-Fi): </w:t>
-      </w:r>
-      <w:r>
-        <w:t>Interacciones: tap en gráfico filtra lista</w:t>
-      </w:r>
-      <w:r>
-        <w:t>; swipe acciones Editar/Eliminar; tap en + bottom sheet animado; estado vacío con Lottie. Valida con test de usabilidad (n=5).</w:t>
-      </w:r>
-    </w:p>
-    <w:p>
-      <w:pPr>
-        <w:pStyle w:val="Ttulo1"/>
-      </w:pPr>
-      <w:r>
-        <w:lastRenderedPageBreak/>
-        <w:t>4. Conclusión Estratégica - Regla de Decisión</w:t>
-      </w:r>
-    </w:p>
-    <w:p>
-      <w:pPr>
-        <w:spacing w:after="40"/>
-      </w:pPr>
-      <w:r>
-        <w:t>Si validas QUÉ se construye -&gt; Wireframe. Si validas CÓMO SE VE -&gt; Mockup. Si valid</w:t>
-      </w:r>
-      <w:r>
-        <w:t>as CÓMO SE SIENTE Y FLUYE -&gt; Prototipo.</w:t>
-      </w:r>
-    </w:p>
-    <w:p>
-      <w:pPr>
-        <w:spacing w:after="40"/>
-      </w:pPr>
-      <w:r>
-        <w:rPr>
-          <w:b/>
-        </w:rPr>
-        <w:t xml:space="preserve">Error crítico que genera costo: </w:t>
-      </w:r>
-      <w:r>
-        <w:t xml:space="preserve">Saltar del wireframe directo a desarrollo sin mockup ni prototipo. Resultado: producto funcionalmente correcto pero visualmente pobre e inusable. El costo de corrección en código es </w:t>
-      </w:r>
-      <w:r>
-        <w:t>10x superior al costo en fase de diseño (Principio de Boehm).</w:t>
-      </w:r>
-    </w:p>
-    <w:p>
-      <w:pPr>
-        <w:spacing w:after="40"/>
-      </w:pPr>
-      <w:r>
-        <w:rPr>
-          <w:b/>
-        </w:rPr>
-        <w:t xml:space="preserve">Estándar académico recomendado: </w:t>
-      </w:r>
-      <w:r>
-        <w:t>Wireframe -&gt; Test de estructura -&gt; Mockup + Design System -&gt; Prototipo High-Fi -&gt; Test de usabilidad (n=5) -&gt; Handoff a desarrollo.</w:t>
-      </w:r>
-      <w:bookmarkStart w:id="0" w:name="_GoBack"/>
-      <w:bookmarkEnd w:id="0"/>
-    </w:p>
-    <w:p>
-      <w:r>
-        <w:br w:type="page"/>
-      </w:r>
-    </w:p>
-    <w:p>
-      <w:pPr>
-        <w:pStyle w:val="Ttulo1"/>
-      </w:pPr>
-      <w:r>
         <w:lastRenderedPageBreak/>
         <w:t>11. Referencias</w:t>
       </w:r>
@@ -1011,10 +1199,7 @@
         <w:spacing w:after="80"/>
       </w:pPr>
       <w:r>
-        <w:t>ISO. (2010). ISO 9241-210: Ergonomía de la interacción persona-sistema - Parte 210: Diseño centrado en el usuario. Organización Internacional para la Estandari</w:t>
-      </w:r>
-      <w:r>
-        <w:t>zación.</w:t>
+        <w:t>ISO. (2010). ISO 9241-210: Ergonomía de la interacción persona-sistema - Parte 210: Diseño centrado en el usuario. Organización Internacional para la Estandarización.</w:t>
       </w:r>
     </w:p>
     <w:p>
@@ -1030,10 +1215,7 @@
         <w:spacing w:after="80"/>
       </w:pPr>
       <w:r>
-        <w:t>Garrett, J. J. (2002). The Elements of User Experience: User-Centered Design for the Web and Beyond. New Rider</w:t>
-      </w:r>
-      <w:r>
-        <w:t>s.</w:t>
+        <w:t>Garrett, J. J. (2002). The Elements of User Experience: User-Centered Design for the Web and Beyond. New Riders.</w:t>
       </w:r>
     </w:p>
     <w:p>
@@ -1057,11 +1239,116 @@
         <w:spacing w:after="80"/>
       </w:pPr>
       <w:r>
-        <w:t>Löwgren, J., &amp; Stolterman, E. (2004). Thoughtful Interacti</w:t>
-      </w:r>
-      <w:r>
-        <w:t>on Design: A Design Perspective on Research-Based Design. Morgan Kaufmann.</w:t>
-      </w:r>
+        <w:t>Löwgren, J., &amp; Stolterman, E. (2004). Thoughtful Interaction Design: A Design Perspective on Research-Based Design. Morgan Kaufmann.</w:t>
+      </w:r>
+    </w:p>
+    <w:p>
+      <w:pPr>
+        <w:spacing w:after="80"/>
+      </w:pPr>
+    </w:p>
+    <w:sdt>
+      <w:sdtPr>
+        <w:rPr>
+          <w:rFonts w:ascii="Calibri" w:eastAsiaTheme="minorEastAsia" w:hAnsi="Calibri" w:cstheme="minorBidi"/>
+          <w:b w:val="0"/>
+          <w:bCs w:val="0"/>
+          <w:color w:val="auto"/>
+          <w:sz w:val="22"/>
+          <w:szCs w:val="22"/>
+          <w:lang w:val="es-ES"/>
+        </w:rPr>
+        <w:id w:val="682404742"/>
+        <w:docPartObj>
+          <w:docPartGallery w:val="Bibliographies"/>
+          <w:docPartUnique/>
+        </w:docPartObj>
+      </w:sdtPr>
+      <w:sdtEndPr>
+        <w:rPr>
+          <w:lang w:val="es-MX"/>
+        </w:rPr>
+      </w:sdtEndPr>
+      <w:sdtContent>
+        <w:p>
+          <w:pPr>
+            <w:pStyle w:val="Ttulo1"/>
+          </w:pPr>
+          <w:r>
+            <w:rPr>
+              <w:lang w:val="es-ES"/>
+            </w:rPr>
+            <w:t>Referencias</w:t>
+          </w:r>
+        </w:p>
+        <w:sdt>
+          <w:sdtPr>
+            <w:id w:val="-573587230"/>
+            <w:bibliography/>
+          </w:sdtPr>
+          <w:sdtEndPr/>
+          <w:sdtContent>
+            <w:p>
+              <w:pPr>
+                <w:pStyle w:val="Bibliografa"/>
+                <w:ind w:left="720" w:hanging="720"/>
+                <w:rPr>
+                  <w:noProof/>
+                  <w:sz w:val="24"/>
+                  <w:szCs w:val="24"/>
+                  <w:lang w:val="es-ES"/>
+                </w:rPr>
+              </w:pPr>
+              <w:r>
+                <w:fldChar w:fldCharType="begin"/>
+              </w:r>
+              <w:r>
+                <w:instrText>BIBLIOGRAPHY</w:instrText>
+              </w:r>
+              <w:r>
+                <w:fldChar w:fldCharType="separate"/>
+              </w:r>
+              <w:r>
+                <w:rPr>
+                  <w:noProof/>
+                  <w:lang w:val="es-ES"/>
+                </w:rPr>
+                <w:t xml:space="preserve">Guilizzoni, P. (8 de mayo de 2025). </w:t>
+              </w:r>
+              <w:r>
+                <w:rPr>
+                  <w:i/>
+                  <w:iCs/>
+                  <w:noProof/>
+                  <w:lang w:val="es-ES"/>
+                </w:rPr>
+                <w:t>balsamiq.com</w:t>
+              </w:r>
+              <w:r>
+                <w:rPr>
+                  <w:noProof/>
+                  <w:lang w:val="es-ES"/>
+                </w:rPr>
+                <w:t>. Obtenido de balsamiq.com: https://balsamiq.com/blog/what-are-wireframes/</w:t>
+              </w:r>
+            </w:p>
+            <w:p>
+              <w:r>
+                <w:rPr>
+                  <w:b/>
+                  <w:bCs/>
+                </w:rPr>
+                <w:fldChar w:fldCharType="end"/>
+              </w:r>
+            </w:p>
+          </w:sdtContent>
+        </w:sdt>
+      </w:sdtContent>
+    </w:sdt>
+    <w:p>
+      <w:pPr>
+        <w:spacing w:after="80"/>
+      </w:pPr>
     </w:p>
     <w:sectPr>
       <w:pgSz w:w="12240" w:h="15840"/>
@@ -13351,6 +13638,45 @@
       </w:tcPr>
     </w:tblStylePr>
   </w:style>
+  <w:style w:type="paragraph" w:styleId="Bibliografa">
+    <w:name w:val="Bibliography"/>
+    <w:basedOn w:val="Normal"/>
+    <w:next w:val="Normal"/>
+    <w:uiPriority w:val="37"/>
+    <w:unhideWhenUsed/>
+    <w:rsid w:val="00421E83"/>
+  </w:style>
+  <w:style w:type="paragraph" w:styleId="Textodeglobo">
+    <w:name w:val="Balloon Text"/>
+    <w:basedOn w:val="Normal"/>
+    <w:link w:val="TextodegloboCar"/>
+    <w:uiPriority w:val="99"/>
+    <w:semiHidden/>
+    <w:unhideWhenUsed/>
+    <w:rsid w:val="006A6B30"/>
+    <w:pPr>
+      <w:spacing w:after="0" w:line="240" w:lineRule="auto"/>
+    </w:pPr>
+    <w:rPr>
+      <w:rFonts w:ascii="Segoe UI" w:hAnsi="Segoe UI" w:cs="Segoe UI"/>
+      <w:sz w:val="18"/>
+      <w:szCs w:val="18"/>
+    </w:rPr>
+  </w:style>
+  <w:style w:type="character" w:customStyle="1" w:styleId="TextodegloboCar">
+    <w:name w:val="Texto de globo Car"/>
+    <w:basedOn w:val="Fuentedeprrafopredeter"/>
+    <w:link w:val="Textodeglobo"/>
+    <w:uiPriority w:val="99"/>
+    <w:semiHidden/>
+    <w:rsid w:val="006A6B30"/>
+    <w:rPr>
+      <w:rFonts w:ascii="Segoe UI" w:hAnsi="Segoe UI" w:cs="Segoe UI"/>
+      <w:sz w:val="18"/>
+      <w:szCs w:val="18"/>
+      <w:lang w:val="es-MX"/>
+    </w:rPr>
+  </w:style>
 </w:styles>
 </file>
 
@@ -13675,11 +14001,53 @@
 </file>
 
 <file path=customXml/item1.xml><?xml version="1.0" encoding="utf-8"?>
-<b:Sources xmlns:b="http://schemas.openxmlformats.org/officeDocument/2006/bibliography" xmlns="http://schemas.openxmlformats.org/officeDocument/2006/bibliography" SelectedStyle="/APA.XSL" StyleName="APA"/>
+<b:Sources xmlns:b="http://schemas.openxmlformats.org/officeDocument/2006/bibliography" xmlns="http://schemas.openxmlformats.org/officeDocument/2006/bibliography" SelectedStyle="\APASixthEditionOfficeOnline.xsl" StyleName="APA" Version="6">
+  <b:Source>
+    <b:Tag>PelGuil</b:Tag>
+    <b:SourceType>InternetSite</b:SourceType>
+    <b:Guid>{CAC68F8E-AEB1-459F-A5C2-F294185C14AA}</b:Guid>
+    <b:Author>
+      <b:Author>
+        <b:NameList>
+          <b:Person>
+            <b:Last>Guilizzoni</b:Last>
+            <b:First>Peldi</b:First>
+          </b:Person>
+        </b:NameList>
+      </b:Author>
+    </b:Author>
+    <b:Title>balsamiq.com</b:Title>
+    <b:InternetSiteTitle>balsamiq.com</b:InternetSiteTitle>
+    <b:Year>2025</b:Year>
+    <b:Month>mayo</b:Month>
+    <b:Day>8</b:Day>
+    <b:URL>https://balsamiq.com/blog/what-are-wireframes/</b:URL>
+    <b:RefOrder>1</b:RefOrder>
+  </b:Source>
+  <b:Source>
+    <b:Tag>Org10</b:Tag>
+    <b:SourceType>ElectronicSource</b:SourceType>
+    <b:Guid>{AA9F94E6-7001-4A47-ACAB-E99017595420}</b:Guid>
+    <b:Author>
+      <b:Author>
+        <b:NameList>
+          <b:Person>
+            <b:Last>(2019)</b:Last>
+            <b:First>Organización</b:First>
+            <b:Middle>Internacional de Normalización.</b:Middle>
+          </b:Person>
+        </b:NameList>
+      </b:Author>
+    </b:Author>
+    <b:Title>Ergonomía de la interacción persona-sistema - Parte 210: Diseño centrado en el humano para los sistemas interactivos</b:Title>
+    <b:Year>2010</b:Year>
+    <b:RefOrder>2</b:RefOrder>
+  </b:Source>
+</b:Sources>
 </file>
 
 <file path=customXml/itemProps1.xml><?xml version="1.0" encoding="utf-8"?>
-<ds:datastoreItem xmlns:ds="http://schemas.openxmlformats.org/officeDocument/2006/customXml" ds:itemID="{514CE5D1-55B2-4836-95D4-2BA789E698F2}">
+<ds:datastoreItem xmlns:ds="http://schemas.openxmlformats.org/officeDocument/2006/customXml" ds:itemID="{F8AB1230-C6E8-448E-9513-0B394642A2DE}">
   <ds:schemaRefs>
     <ds:schemaRef ds:uri="http://schemas.openxmlformats.org/officeDocument/2006/bibliography"/>
   </ds:schemaRefs>

</xml_diff>